<commit_message>
auto: XHS cards — 2026-07-27
</commit_message>
<xml_diff>
--- a/docs/xhs/2026-07-27/历史故事/发布文案.docx
+++ b/docs/xhs/2026-07-27/历史故事/发布文案.docx
@@ -11,7 +11,7 @@
         <w:rPr>
           <w:color w:val="CC3333"/>
         </w:rPr>
-        <w:t>想变通透？这10个故事绝了！</w:t>
+        <w:t>历史课本不敢写的10个真相，绝了！</w:t>
       </w:r>
     </w:p>
     <w:p>
@@ -40,22 +40,24 @@
         <w:spacing w:line="384" w:lineRule="auto"/>
       </w:pPr>
       <w:r>
-        <w:t>勾践舔了三年苦胆，不是变态，是顶级自律。🤯 他在草堆上睡觉，每天问自己“你忘了耻辱吗”，最后三千越甲吞了吴——原来真正的复仇，是在最低谷把牙咬碎，默默蓄力。🔥</w:t>
+        <w:t>你敢信？明朝有个叫海瑞的狠人，直接给自己买好棺材，把妻子仆人遣散，然后揣着奏疏去骂皇帝：“嘉靖嘉靖，家家皆净！”嘉靖帝气得把奏折摔地上，又捡起来读了三遍，最后只说：这人比商朝的比干还难搞。</w:t>
         <w:br/>
         <w:br/>
-        <w:t>📖 还有信陵君，救赵国靠的不是兵符，是平日里攒下的人心。侯嬴七十岁给他出死计，如姬偷符报恩，连屠夫都敢陪他拼命。那一刻我突然懂了：关键时刻能救你的，从来不是“资源”，是你对别人好过的每一件小事。</w:t>
+        <w:t>这还是人吗？😱</w:t>
+        <w:br/>
+        <w:t>更绝的在战国。豫让为了给主公报仇，漆涂全身长满癞疮，吞炭烫坏嗓子，连亲老婆都认不出他。两次刺杀赵襄子未遂，最后只求对方脱下外套，他拔剑跳起来砍了三下：“我算是报答智伯了！”然后自刎而死。这就是“士为知己者死”最极致的版本。💀</w:t>
         <w:br/>
         <w:br/>
-        <w:t>💡 毛遂自荐更扎心。在平原君门下吃三年闲饭，没人多看他一眼，直到自己站到C位，一句“锥处囊中，脱颖而出”啪啪打脸所有看不起他的人。机会不是等来的，是把自己磨成锥子，直接刺破壁垒。</w:t>
+        <w:t>唐朝安史之乱，张巡带着几千人死守睢阳，被十几万叛军围了十个月。粮食吃光了，先杀马，再吃树皮老鼠，最后“食人为继”。城破时他咬着牙大骂敌军，牙齿都咬碎了。明知守不住，偏要守——就是这股气节，保住了大唐最后的屏障。</w:t>
         <w:br/>
         <w:br/>
-        <w:t>🌿 最后被腊八节传说暖到了。牧羊女一碗奶粥，让苦修六年的释迦牟尼恢复体力，在菩提树下悟道。原来小小的善意，能托举起一个觉醒的灵魂。这碗粥提醒我们：既要养身体，也要养心里的光。</w:t>
+        <w:t>但最让我破防的是弦高。一个普通牛贩子，在路上碰到秦国大军要偷袭郑国，他急中生智，装作郑国使者，送上四张牛皮和十二头牛，说：“我们国君知道您要来，特来犒劳。”秦军一听以为对方有防备，就撤了。一个商人的机智，救了一整个国家。🐂</w:t>
         <w:br/>
         <w:br/>
-        <w:t>📜 历史从来不只讲过去，它把答案藏进故事里。读这些典故，就像在跟一群最聪明最硬气的人聊天，聊着聊着，你发现自己不再害怕低谷，也看得懂人性的幽微。我常在想，这大概就是“读史明智”的意思——不是变老练，是获得俯瞰生活的高维视角。</w:t>
+        <w:t>这些故事，哪是课本里一句“爱国人士”“忠臣义士”能概括的？他们真的拿命在活。答应我，别只在考试时背他们。</w:t>
         <w:br/>
         <w:br/>
-        <w:t>你最近有被哪个历史故事击中吗？评论里聊聊，说不定就照亮谁的路。✨</w:t>
+        <w:t>你最被哪个古人的选择震撼到？👇</w:t>
       </w:r>
     </w:p>
     <w:p>
@@ -71,7 +73,7 @@
         <w:rPr>
           <w:color w:val="CC3333"/>
         </w:rPr>
-        <w:t>#历史故事  #国学智慧  #成语典故  #古人智慧  #每天学点历史  #传统文化  #自我提升  #格局打开</w:t>
+        <w:t>#历史故事  #国学智慧  #古人智慧  #每天学点历史  #传统文化  #冷知识  #格局打开</w:t>
       </w:r>
     </w:p>
     <w:p>
@@ -88,7 +90,7 @@
           <w:b/>
           <w:sz w:val="32"/>
         </w:rPr>
-        <w:t>古人卷疯了</w:t>
+        <w:t>看完我跪了</w:t>
       </w:r>
     </w:p>
     <w:p>
@@ -107,7 +109,7 @@
         <w:rPr>
           <w:sz w:val="24"/>
         </w:rPr>
-        <w:t>#1  春秋 · 卧薪尝胆  [历史故事]</w:t>
+        <w:t>#1  春秋 · 弦高犒师  [历史故事]</w:t>
       </w:r>
     </w:p>
     <w:p>
@@ -115,7 +117,7 @@
         <w:spacing w:line="336" w:lineRule="auto"/>
       </w:pPr>
       <w:r>
-        <w:t>💡 面对巨大挫折，隐忍积蓄力量远比逞强报复更明智；持久的自律和不忘耻辱，终能扭转乾坤。</w:t>
+        <w:t>💡 位卑未敢忘忧国，真正的爱国者不因身份低微而袖手旁观。弦高用机智和牺牲精神挽救了国家。</w:t>
       </w:r>
     </w:p>
     <w:p/>
@@ -127,7 +129,7 @@
         <w:rPr>
           <w:sz w:val="24"/>
         </w:rPr>
-        <w:t>#2  战国 · 窃符救赵  [历史故事]</w:t>
+        <w:t>#2  春秋 · 申包胥哭秦庭  [历史故事]</w:t>
       </w:r>
     </w:p>
     <w:p>
@@ -135,7 +137,7 @@
         <w:spacing w:line="336" w:lineRule="auto"/>
       </w:pPr>
       <w:r>
-        <w:t>💡 关键时刻要靠智慧与义气化解危机，信陵君礼贤下士，获得众人冒死相助，体现人心储备比兵符更重要。</w:t>
+        <w:t>💡 至诚可动天。申包胥的赤心不仅感动秦国君臣，更实现了“楚虽三户，亡秦必楚”前的一次起死回生。</w:t>
       </w:r>
     </w:p>
     <w:p/>
@@ -147,7 +149,7 @@
         <w:rPr>
           <w:sz w:val="24"/>
         </w:rPr>
-        <w:t>#3  战国 · 毛遂自荐  [历史故事]</w:t>
+        <w:t>#3  战国 · 豫让漆身吞炭  [历史故事]</w:t>
       </w:r>
     </w:p>
     <w:p>
@@ -155,7 +157,7 @@
         <w:spacing w:line="336" w:lineRule="auto"/>
       </w:pPr>
       <w:r>
-        <w:t>💡 自信与行动力是机会的敲门砖；才能在关键时刻展现，胜过平日空谈。</w:t>
+        <w:t>💡 “士为知己者死”，豫让以极端的方式诠释了古代士人的忠诚与气节，纵是敌手也为之动容。</w:t>
       </w:r>
     </w:p>
     <w:p/>
@@ -167,7 +169,7 @@
         <w:rPr>
           <w:sz w:val="24"/>
         </w:rPr>
-        <w:t>#4  战国末期 · 荆轲刺秦王  [历史故事]</w:t>
+        <w:t>#4  战国 · 侯赢北乡自刭  [历史故事]</w:t>
       </w:r>
     </w:p>
     <w:p>
@@ -175,7 +177,7 @@
         <w:spacing w:line="336" w:lineRule="auto"/>
       </w:pPr>
       <w:r>
-        <w:t>💡 舍生取义虽败犹荣，孤注一掷需要周密计划；同时印证“天时地利人和”缺一不可。</w:t>
+        <w:t>💡 侯赢用智慧助信陵君成大事，用生命践行忠义，一诺重于泰山，展现了战国策士的极致风范。</w:t>
       </w:r>
     </w:p>
     <w:p/>
@@ -187,7 +189,7 @@
         <w:rPr>
           <w:sz w:val="24"/>
         </w:rPr>
-        <w:t>#5  春秋 · 晏子使楚  [历史故事]</w:t>
+        <w:t>#5  唐 · 张巡死守睢阳  [历史故事]</w:t>
       </w:r>
     </w:p>
     <w:p>
@@ -195,7 +197,7 @@
         <w:spacing w:line="336" w:lineRule="auto"/>
       </w:pPr>
       <w:r>
-        <w:t>💡 以机智幽默化解羞辱，既维护个人尊严，又守住国家体面，彰显语言的力量。</w:t>
+        <w:t>💡 明知不可为而为之，张巡以惨烈牺牲稳定了乱局，用生命诠释了守土之责与气节。</w:t>
       </w:r>
     </w:p>
     <w:p/>
@@ -207,7 +209,7 @@
         <w:rPr>
           <w:sz w:val="24"/>
         </w:rPr>
-        <w:t>#6  东汉 · 投笔从戎  [历史故事]</w:t>
+        <w:t>#6  明 · 海瑞备棺上疏  [历史故事]</w:t>
       </w:r>
     </w:p>
     <w:p>
@@ -215,7 +217,7 @@
         <w:spacing w:line="336" w:lineRule="auto"/>
       </w:pPr>
       <w:r>
-        <w:t>💡 人生的转折往往源于一次果敢选择，远大的志向配上踏实行动才能改变命运。</w:t>
+        <w:t>💡 犯颜直谏虽险，然忠臣之心可照日月。海瑞以“死谏”唤醒统治者，成为清廉刚正的千古楷模。</w:t>
       </w:r>
     </w:p>
     <w:p/>
@@ -235,7 +237,7 @@
         <w:spacing w:line="336" w:lineRule="auto"/>
       </w:pPr>
       <w:r>
-        <w:t>💡 整合创新比凭空发明的意义更大。蔡伦改良造纸术，让知识传播跨越阶层，深刻影响人类文明。</w:t>
+        <w:t>💡 创新往往源于对身边事物细致观察和反复实践。蔡伦造纸，让知识传播从上层走向大众。</w:t>
       </w:r>
     </w:p>
     <w:p/>
@@ -255,7 +257,7 @@
         <w:spacing w:line="336" w:lineRule="auto"/>
       </w:pPr>
       <w:r>
-        <w:t>💡 善用自然之力解放人力，是古代科技智慧的精髓。因地制宜的创新能极大推动生产力。</w:t>
+        <w:t>💡 善用自然之力，事半功倍。杜诗水排证明了科技革新对民生的巨大推动作用。</w:t>
       </w:r>
     </w:p>
     <w:p/>
@@ -267,7 +269,7 @@
         <w:rPr>
           <w:sz w:val="24"/>
         </w:rPr>
-        <w:t>#9  古印度传入 · 腊八节传说：佛成道日  [传统节日传说]</w:t>
+        <w:t>#9  春秋 · 鲁班造锯与鲁班锁  [古代科技发明故事]</w:t>
       </w:r>
     </w:p>
     <w:p>
@@ -275,7 +277,7 @@
         <w:spacing w:line="336" w:lineRule="auto"/>
       </w:pPr>
       <w:r>
-        <w:t>💡 慈悲与分享的习俗根植于感恩。一碗粥传递温暖与觉醒，提醒人们物质和精神皆要滋养。</w:t>
+        <w:t>💡 生活处处有学问。鲁班善于从微小现象中捕捉灵感，把自然启示转化为造福千秋的工具。</w:t>
       </w:r>
     </w:p>
     <w:p/>
@@ -287,7 +289,7 @@
         <w:rPr>
           <w:sz w:val="24"/>
         </w:rPr>
-        <w:t>#10  起源汉代 · 祭灶王与过小年  [传统节日传说]</w:t>
+        <w:t>#10  元 · 黄道婆改进纺织技术  [古代科技发明故事]</w:t>
       </w:r>
     </w:p>
     <w:p>
@@ -295,7 +297,7 @@
         <w:spacing w:line="336" w:lineRule="auto"/>
       </w:pPr>
       <w:r>
-        <w:t>💡 敬畏与自省是民间信仰的核心。祭灶提醒人们心存善念，也寄托对家庭平安的朴素愿望。</w:t>
+        <w:t>💡 技术交流打破地域壁垒，黄道婆融合汉黎技术，以平民之身推动了一场产业革命。</w:t>
       </w:r>
     </w:p>
     <w:p/>

</xml_diff>

<commit_message>
auto: XHS cards — 2026-07-28
</commit_message>
<xml_diff>
--- a/docs/xhs/2026-07-27/历史故事/发布文案.docx
+++ b/docs/xhs/2026-07-27/历史故事/发布文案.docx
@@ -11,7 +11,7 @@
         <w:rPr>
           <w:color w:val="CC3333"/>
         </w:rPr>
-        <w:t>历史课本不敢写的10个真相，绝了！</w:t>
+        <w:t>10个古人神操作，格局炸裂</w:t>
       </w:r>
     </w:p>
     <w:p>
@@ -40,24 +40,28 @@
         <w:spacing w:line="384" w:lineRule="auto"/>
       </w:pPr>
       <w:r>
-        <w:t>你敢信？明朝有个叫海瑞的狠人，直接给自己买好棺材，把妻子仆人遣散，然后揣着奏疏去骂皇帝：“嘉靖嘉靖，家家皆净！”嘉靖帝气得把奏折摔地上，又捡起来读了三遍，最后只说：这人比商朝的比干还难搞。</w:t>
+        <w:t>你知道吗？战国大将吴起用嘴给士兵吸脓血，士兵母亲却嚎啕大哭——因为吴起当年也这样对她丈夫，结果丈夫不要命地战死了。😱</w:t>
         <w:br/>
         <w:br/>
-        <w:t>这还是人吗？😱</w:t>
-        <w:br/>
-        <w:t>更绝的在战国。豫让为了给主公报仇，漆涂全身长满癞疮，吞炭烫坏嗓子，连亲老婆都认不出他。两次刺杀赵襄子未遂，最后只求对方脱下外套，他拔剑跳起来砍了三下：“我算是报答智伯了！”然后自刎而死。这就是“士为知己者死”最极致的版本。💀</w:t>
+        <w:t>这就是“吴起吮疽”，恩情有时比刀剑更锋利。今天这10个故事，每个都藏着颠覆认知的顶级智慧，看懂的人直接打开任督二脉！🔥</w:t>
         <w:br/>
         <w:br/>
-        <w:t>唐朝安史之乱，张巡带着几千人死守睢阳，被十几万叛军围了十个月。粮食吃光了，先杀马，再吃树皮老鼠，最后“食人为继”。城破时他咬着牙大骂敌军，牙齿都咬碎了。明知守不住，偏要守——就是这股气节，保住了大唐最后的屏障。</w:t>
+        <w:t>📖 燕昭王想招贤复仇，谋士却让他先花五百金买一副死马骨头。消息传开，天下人才疯了：“连骨头都这么贵，活马还得了？”一年内千里马送来三匹。真高手从不说“求贤若渴”，他们直接制造稀缺幻觉。</w:t>
         <w:br/>
         <w:br/>
-        <w:t>但最让我破防的是弦高。一个普通牛贩子，在路上碰到秦国大军要偷袭郑国，他急中生智，装作郑国使者，送上四张牛皮和十二头牛，说：“我们国君知道您要来，特来犒劳。”秦军一听以为对方有防备，就撤了。一个商人的机智，救了一整个国家。🐂</w:t>
+        <w:t>⚔️ 汉文帝劳军，到周亚夫的细柳营彻底吃瘪。天子车驾被拦在门外：“军中只闻将军令，不闻天子诏。”文帝反而加封周亚夫。规则面前没有VIP通道，这才是顶级自律。</w:t>
         <w:br/>
         <w:br/>
-        <w:t>这些故事，哪是课本里一句“爱国人士”“忠臣义士”能概括的？他们真的拿命在活。答应我，别只在考试时背他们。</w:t>
+        <w:t>🏯 王徽之雪夜划船一整夜去看朋友，到门口却掉头就走：“乘兴而来，兴尽而返。”现代人打卡发朋友圈，魏晋名士玩的是过程即奖赏。</w:t>
         <w:br/>
         <w:br/>
-        <w:t>你最被哪个古人的选择震撼到？👇</w:t>
+        <w:t>💡 为什么穷人越施恩越卑微，聪明人越示诚越贵气？因为燕昭王买的是死马，卖的是人设；吴起吸的是脓血，锁的却是生死。</w:t>
+        <w:br/>
+        <w:br/>
+        <w:t>你一直被教育“付出必有回报”，但古人早就点透：真正的价值不在于你付出多少，而在于你如何定义游戏规则。🤯</w:t>
+        <w:br/>
+        <w:br/>
+        <w:t>如果穿越回古代，你最想偷师哪个故事？👇</w:t>
       </w:r>
     </w:p>
     <w:p>
@@ -73,7 +77,7 @@
         <w:rPr>
           <w:color w:val="CC3333"/>
         </w:rPr>
-        <w:t>#历史故事  #国学智慧  #古人智慧  #每天学点历史  #传统文化  #冷知识  #格局打开</w:t>
+        <w:t>#历史故事  #国学智慧  #古人智慧  #格局打开  #每天学点历史  #冷知识  #自我提升</w:t>
       </w:r>
     </w:p>
     <w:p>
@@ -90,7 +94,7 @@
           <w:b/>
           <w:sz w:val="32"/>
         </w:rPr>
-        <w:t>看完我跪了</w:t>
+        <w:t>格局炸裂！</w:t>
       </w:r>
     </w:p>
     <w:p>
@@ -109,7 +113,7 @@
         <w:rPr>
           <w:sz w:val="24"/>
         </w:rPr>
-        <w:t>#1  春秋 · 弦高犒师  [历史故事]</w:t>
+        <w:t>#1  战国 · 千金买马骨  [历史故事]</w:t>
       </w:r>
     </w:p>
     <w:p>
@@ -117,7 +121,7 @@
         <w:spacing w:line="336" w:lineRule="auto"/>
       </w:pPr>
       <w:r>
-        <w:t>💡 位卑未敢忘忧国，真正的爱国者不因身份低微而袖手旁观。弦高用机智和牺牲精神挽救了国家。</w:t>
+        <w:t>💡 欲引英才先示诚，善待现有资源，良好声誉会自动吸引真正人才。</w:t>
       </w:r>
     </w:p>
     <w:p/>
@@ -129,7 +133,7 @@
         <w:rPr>
           <w:sz w:val="24"/>
         </w:rPr>
-        <w:t>#2  春秋 · 申包胥哭秦庭  [历史故事]</w:t>
+        <w:t>#2  战国 · 吴起吮疽  [历史故事]</w:t>
       </w:r>
     </w:p>
     <w:p>
@@ -137,7 +141,7 @@
         <w:spacing w:line="336" w:lineRule="auto"/>
       </w:pPr>
       <w:r>
-        <w:t>💡 至诚可动天。申包胥的赤心不仅感动秦国君臣，更实现了“楚虽三户，亡秦必楚”前的一次起死回生。</w:t>
+        <w:t>💡 真诚关怀能赢得下属死力相报，但过度倚赖恩义也可能走向悲剧。</w:t>
       </w:r>
     </w:p>
     <w:p/>
@@ -149,7 +153,7 @@
         <w:rPr>
           <w:sz w:val="24"/>
         </w:rPr>
-        <w:t>#3  战国 · 豫让漆身吞炭  [历史故事]</w:t>
+        <w:t>#3  西汉 · 细柳营  [历史故事]</w:t>
       </w:r>
     </w:p>
     <w:p>
@@ -157,7 +161,7 @@
         <w:spacing w:line="336" w:lineRule="auto"/>
       </w:pPr>
       <w:r>
-        <w:t>💡 “士为知己者死”，豫让以极端的方式诠释了古代士人的忠诚与气节，纵是敌手也为之动容。</w:t>
+        <w:t>💡 纪律面前无特权，唯有严守规矩才可令行禁止、克敌制胜。</w:t>
       </w:r>
     </w:p>
     <w:p/>
@@ -169,7 +173,7 @@
         <w:rPr>
           <w:sz w:val="24"/>
         </w:rPr>
-        <w:t>#4  战国 · 侯赢北乡自刭  [历史故事]</w:t>
+        <w:t>#4  三国 · 周瑜雅量  [历史故事]</w:t>
       </w:r>
     </w:p>
     <w:p>
@@ -177,7 +181,7 @@
         <w:spacing w:line="336" w:lineRule="auto"/>
       </w:pPr>
       <w:r>
-        <w:t>💡 侯赢用智慧助信陵君成大事，用生命践行忠义，一诺重于泰山，展现了战国策士的极致风范。</w:t>
+        <w:t>💡 宽容和理解往往比针锋相对更能赢得他人真心敬服。</w:t>
       </w:r>
     </w:p>
     <w:p/>
@@ -189,7 +193,7 @@
         <w:rPr>
           <w:sz w:val="24"/>
         </w:rPr>
-        <w:t>#5  唐 · 张巡死守睢阳  [历史故事]</w:t>
+        <w:t>#5  东晋 · 雪夜访戴  [历史故事]</w:t>
       </w:r>
     </w:p>
     <w:p>
@@ -197,7 +201,7 @@
         <w:spacing w:line="336" w:lineRule="auto"/>
       </w:pPr>
       <w:r>
-        <w:t>💡 明知不可为而为之，张巡以惨烈牺牲稳定了乱局，用生命诠释了守土之责与气节。</w:t>
+        <w:t>💡 过程本身比结果更值得享受，率性不拘俗更能体验生命的真趣。</w:t>
       </w:r>
     </w:p>
     <w:p/>
@@ -209,7 +213,7 @@
         <w:rPr>
           <w:sz w:val="24"/>
         </w:rPr>
-        <w:t>#6  明 · 海瑞备棺上疏  [历史故事]</w:t>
+        <w:t>#6  唐 · 张巡草人借箭  [历史故事]</w:t>
       </w:r>
     </w:p>
     <w:p>
@@ -217,7 +221,7 @@
         <w:spacing w:line="336" w:lineRule="auto"/>
       </w:pPr>
       <w:r>
-        <w:t>💡 犯颜直谏虽险，然忠臣之心可照日月。海瑞以“死谏”唤醒统治者，成为清廉刚正的千古楷模。</w:t>
+        <w:t>💡 巧用对方惯性思维，真真假假变换，能使有限资源发挥最大威力。</w:t>
       </w:r>
     </w:p>
     <w:p/>
@@ -229,7 +233,7 @@
         <w:rPr>
           <w:sz w:val="24"/>
         </w:rPr>
-        <w:t>#7  东汉 · 蔡伦改进造纸术  [古代科技发明故事]</w:t>
+        <w:t>#7  东汉 · 蔡伦造纸  [古代科技发明]</w:t>
       </w:r>
     </w:p>
     <w:p>
@@ -237,7 +241,7 @@
         <w:spacing w:line="336" w:lineRule="auto"/>
       </w:pPr>
       <w:r>
-        <w:t>💡 创新往往源于对身边事物细致观察和反复实践。蔡伦造纸，让知识传播从上层走向大众。</w:t>
+        <w:t>💡 从废弃之物中开创新事物，技术创新往往来自对现实痛点的敏锐观察与大胆反复实践。</w:t>
       </w:r>
     </w:p>
     <w:p/>
@@ -249,7 +253,7 @@
         <w:rPr>
           <w:sz w:val="24"/>
         </w:rPr>
-        <w:t>#8  东汉 · 杜诗造水排  [古代科技发明故事]</w:t>
+        <w:t>#8  战国 · 甘德发现木卫  [古代科技发明]</w:t>
       </w:r>
     </w:p>
     <w:p>
@@ -257,7 +261,7 @@
         <w:spacing w:line="336" w:lineRule="auto"/>
       </w:pPr>
       <w:r>
-        <w:t>💡 善用自然之力，事半功倍。杜诗水排证明了科技革新对民生的巨大推动作用。</w:t>
+        <w:t>💡 人类对宇宙的好奇与探索精神，可以凭借耐心和细致突破工具的限制。</w:t>
       </w:r>
     </w:p>
     <w:p/>
@@ -269,7 +273,7 @@
         <w:rPr>
           <w:sz w:val="24"/>
         </w:rPr>
-        <w:t>#9  春秋 · 鲁班造锯与鲁班锁  [古代科技发明故事]</w:t>
+        <w:t>#9  东汉 · 冬至娇耳  [传统节日传说]</w:t>
       </w:r>
     </w:p>
     <w:p>
@@ -277,7 +281,7 @@
         <w:spacing w:line="336" w:lineRule="auto"/>
       </w:pPr>
       <w:r>
-        <w:t>💡 生活处处有学问。鲁班善于从微小现象中捕捉灵感，把自然启示转化为造福千秋的工具。</w:t>
+        <w:t>💡 医者的仁心可以升华为世代相传的习俗，文化与温情的结合长存人间。</w:t>
       </w:r>
     </w:p>
     <w:p/>
@@ -289,7 +293,7 @@
         <w:rPr>
           <w:sz w:val="24"/>
         </w:rPr>
-        <w:t>#10  元 · 黄道婆改进纺织技术  [古代科技发明故事]</w:t>
+        <w:t>#10  东晋 · 兰亭修禊  [传统节日传说]</w:t>
       </w:r>
     </w:p>
     <w:p>
@@ -297,7 +301,7 @@
         <w:spacing w:line="336" w:lineRule="auto"/>
       </w:pPr>
       <w:r>
-        <w:t>💡 技术交流打破地域壁垒，黄道婆融合汉黎技术，以平民之身推动了一场产业革命。</w:t>
+        <w:t>💡 诗意的生活与自然交融，无拘无束的雅集能催生不朽的艺术杰作。</w:t>
       </w:r>
     </w:p>
     <w:p/>

</xml_diff>